<commit_message>
Practiced rotation with k
</commit_message>
<xml_diff>
--- a/Theory/Learning.docx
+++ b/Theory/Learning.docx
@@ -2,6 +2,245 @@
 <file path=word/document.xml><?xml version="1.0" encoding="utf-8"?>
 <w:document xmlns:wpc="http://schemas.microsoft.com/office/word/2010/wordprocessingCanvas" xmlns:cx="http://schemas.microsoft.com/office/drawing/2014/chartex" xmlns:cx1="http://schemas.microsoft.com/office/drawing/2015/9/8/chartex" xmlns:cx2="http://schemas.microsoft.com/office/drawing/2015/10/21/chartex" xmlns:cx3="http://schemas.microsoft.com/office/drawing/2016/5/9/chartex" xmlns:cx4="http://schemas.microsoft.com/office/drawing/2016/5/10/chartex" xmlns:cx5="http://schemas.microsoft.com/office/drawing/2016/5/11/chartex" xmlns:cx6="http://schemas.microsoft.com/office/drawing/2016/5/12/chartex" xmlns:cx7="http://schemas.microsoft.com/office/drawing/2016/5/13/chartex" xmlns:cx8="http://schemas.microsoft.com/office/drawing/2016/5/14/chartex" xmlns:mc="http://schemas.openxmlformats.org/markup-compatibility/2006" xmlns:aink="http://schemas.microsoft.com/office/drawing/2016/ink" xmlns:am3d="http://schemas.microsoft.com/office/drawing/2017/model3d" xmlns:o="urn:schemas-microsoft-com:office:office" xmlns:oel="http://schemas.microsoft.com/office/2019/extlst" xmlns:r="http://schemas.openxmlformats.org/officeDocument/2006/relationships" xmlns:m="http://schemas.openxmlformats.org/officeDocument/2006/math" xmlns:v="urn:schemas-microsoft-com:vml" xmlns:wp14="http://schemas.microsoft.com/office/word/2010/wordprocessingDrawing" xmlns:wp="http://schemas.openxmlformats.org/drawingml/2006/wordprocessingDrawing" xmlns:w10="urn:schemas-microsoft-com:office:word" xmlns:w="http://schemas.openxmlformats.org/wordprocessingml/2006/main" xmlns:w14="http://schemas.microsoft.com/office/word/2010/wordml" xmlns:w15="http://schemas.microsoft.com/office/word/2012/wordml" xmlns:w16cex="http://schemas.microsoft.com/office/word/2018/wordml/cex" xmlns:w16cid="http://schemas.microsoft.com/office/word/2016/wordml/cid" xmlns:w16="http://schemas.microsoft.com/office/word/2018/wordml" xmlns:w16du="http://schemas.microsoft.com/office/word/2023/wordml/word16du" xmlns:w16sdtdh="http://schemas.microsoft.com/office/word/2020/wordml/sdtdatahash" xmlns:w16sdtfl="http://schemas.microsoft.com/office/word/2024/wordml/sdtformatlock" xmlns:w16se="http://schemas.microsoft.com/office/word/2015/wordml/symex" xmlns:wpg="http://schemas.microsoft.com/office/word/2010/wordprocessingGroup" xmlns:wpi="http://schemas.microsoft.com/office/word/2010/wordprocessingInk" xmlns:wne="http://schemas.microsoft.com/office/word/2006/wordml" xmlns:wps="http://schemas.microsoft.com/office/word/2010/wordprocessingShape" mc:Ignorable="w14 w15 w16se w16cid w16 w16cex w16sdtdh w16sdtfl w16du wp14">
   <w:body>
+    <w:p>
+      <w:pPr>
+        <w:rPr>
+          <w:b/>
+          <w:bCs/>
+          <w:sz w:val="32"/>
+          <w:szCs w:val="32"/>
+        </w:rPr>
+      </w:pPr>
+      <w:r>
+        <w:rPr>
+          <w:b/>
+          <w:bCs/>
+          <w:sz w:val="32"/>
+          <w:szCs w:val="32"/>
+        </w:rPr>
+        <w:t>Arrays</w:t>
+      </w:r>
+    </w:p>
+    <w:p>
+      <w:r>
+        <w:t xml:space="preserve">For rotation </w:t>
+      </w:r>
+    </w:p>
+    <w:p>
+      <w:r>
+        <w:t xml:space="preserve">If we want to rotate the array for k times and so k can be greater </w:t>
+      </w:r>
+      <w:proofErr w:type="gramStart"/>
+      <w:r>
+        <w:t>then</w:t>
+      </w:r>
+      <w:proofErr w:type="gramEnd"/>
+      <w:r>
+        <w:t xml:space="preserve"> length of the array.</w:t>
+      </w:r>
+    </w:p>
+    <w:p>
+      <w:r>
+        <w:t>We can use the formula k=</w:t>
+      </w:r>
+      <w:proofErr w:type="spellStart"/>
+      <w:r>
+        <w:t>k%n</w:t>
+      </w:r>
+      <w:proofErr w:type="spellEnd"/>
+      <w:r>
+        <w:t xml:space="preserve"> to fix this problem.</w:t>
+      </w:r>
+    </w:p>
+    <w:p>
+      <w:r>
+        <w:rPr>
+          <w:b/>
+          <w:bCs/>
+        </w:rPr>
+        <w:t>Right rotation</w:t>
+      </w:r>
+      <w:r>
+        <w:t xml:space="preserve"> means u take the elements from the right and put in the left</w:t>
+      </w:r>
+    </w:p>
+    <w:p>
+      <w:r>
+        <w:rPr>
+          <w:b/>
+          <w:bCs/>
+        </w:rPr>
+        <w:t>Left rotation</w:t>
+      </w:r>
+      <w:r>
+        <w:t xml:space="preserve"> means u take the elements from the left and put in the right</w:t>
+      </w:r>
+    </w:p>
+    <w:p/>
+    <w:p>
+      <w:pPr>
+        <w:rPr>
+          <w:b/>
+          <w:bCs/>
+        </w:rPr>
+      </w:pPr>
+      <w:r>
+        <w:rPr>
+          <w:b/>
+          <w:bCs/>
+        </w:rPr>
+        <w:t>Why did temp = [...temp2] not "push" to temp?</w:t>
+      </w:r>
+    </w:p>
+    <w:p>
+      <w:r>
+        <w:t>[...temp2] does </w:t>
+      </w:r>
+      <w:r>
+        <w:rPr>
+          <w:b/>
+          <w:bCs/>
+        </w:rPr>
+        <w:t>not push into</w:t>
+      </w:r>
+      <w:r>
+        <w:t> temp. It creates a </w:t>
+      </w:r>
+      <w:proofErr w:type="gramStart"/>
+      <w:r>
+        <w:rPr>
+          <w:b/>
+          <w:bCs/>
+        </w:rPr>
+        <w:t>brand new</w:t>
+      </w:r>
+      <w:proofErr w:type="gramEnd"/>
+      <w:r>
+        <w:rPr>
+          <w:b/>
+          <w:bCs/>
+        </w:rPr>
+        <w:t xml:space="preserve"> array</w:t>
+      </w:r>
+      <w:r>
+        <w:t> and reassigns temp to point to it.</w:t>
+      </w:r>
+    </w:p>
+    <w:p>
+      <w:r>
+        <w:drawing>
+          <wp:inline distT="0" distB="0" distL="0" distR="0" wp14:anchorId="2E6F54B7" wp14:editId="5642D975">
+            <wp:extent cx="5943600" cy="419100"/>
+            <wp:effectExtent l="0" t="0" r="0" b="0"/>
+            <wp:docPr id="1070077053" name="Picture 1"/>
+            <wp:cNvGraphicFramePr>
+              <a:graphicFrameLocks xmlns:a="http://schemas.openxmlformats.org/drawingml/2006/main" noChangeAspect="1"/>
+            </wp:cNvGraphicFramePr>
+            <a:graphic xmlns:a="http://schemas.openxmlformats.org/drawingml/2006/main">
+              <a:graphicData uri="http://schemas.openxmlformats.org/drawingml/2006/picture">
+                <pic:pic xmlns:pic="http://schemas.openxmlformats.org/drawingml/2006/picture">
+                  <pic:nvPicPr>
+                    <pic:cNvPr id="1070077053" name=""/>
+                    <pic:cNvPicPr/>
+                  </pic:nvPicPr>
+                  <pic:blipFill>
+                    <a:blip r:embed="rId5"/>
+                    <a:stretch>
+                      <a:fillRect/>
+                    </a:stretch>
+                  </pic:blipFill>
+                  <pic:spPr>
+                    <a:xfrm>
+                      <a:off x="0" y="0"/>
+                      <a:ext cx="5943600" cy="419100"/>
+                    </a:xfrm>
+                    <a:prstGeom prst="rect">
+                      <a:avLst/>
+                    </a:prstGeom>
+                  </pic:spPr>
+                </pic:pic>
+              </a:graphicData>
+            </a:graphic>
+          </wp:inline>
+        </w:drawing>
+      </w:r>
+    </w:p>
+    <w:p>
+      <w:proofErr w:type="gramStart"/>
+      <w:r>
+        <w:t>So</w:t>
+      </w:r>
+      <w:proofErr w:type="gramEnd"/>
+      <w:r>
+        <w:t xml:space="preserve"> whatever you had built in temp from the first loop is </w:t>
+      </w:r>
+      <w:r>
+        <w:rPr>
+          <w:b/>
+          <w:bCs/>
+        </w:rPr>
+        <w:t>thrown away</w:t>
+      </w:r>
+      <w:r>
+        <w:t>. The variable temp now just points to a fresh copy of temp2.</w:t>
+      </w:r>
+    </w:p>
+    <w:p>
+      <w:r>
+        <w:t>What you likely wanted was to </w:t>
+      </w:r>
+      <w:r>
+        <w:rPr>
+          <w:b/>
+          <w:bCs/>
+        </w:rPr>
+        <w:t>concatenate</w:t>
+      </w:r>
+      <w:r>
+        <w:t>, not replace:</w:t>
+      </w:r>
+    </w:p>
+    <w:p>
+      <w:r>
+        <w:drawing>
+          <wp:inline distT="0" distB="0" distL="0" distR="0" wp14:anchorId="583308D1" wp14:editId="570EBB6C">
+            <wp:extent cx="5943600" cy="389255"/>
+            <wp:effectExtent l="0" t="0" r="0" b="0"/>
+            <wp:docPr id="97168809" name="Picture 1"/>
+            <wp:cNvGraphicFramePr>
+              <a:graphicFrameLocks xmlns:a="http://schemas.openxmlformats.org/drawingml/2006/main" noChangeAspect="1"/>
+            </wp:cNvGraphicFramePr>
+            <a:graphic xmlns:a="http://schemas.openxmlformats.org/drawingml/2006/main">
+              <a:graphicData uri="http://schemas.openxmlformats.org/drawingml/2006/picture">
+                <pic:pic xmlns:pic="http://schemas.openxmlformats.org/drawingml/2006/picture">
+                  <pic:nvPicPr>
+                    <pic:cNvPr id="97168809" name=""/>
+                    <pic:cNvPicPr/>
+                  </pic:nvPicPr>
+                  <pic:blipFill>
+                    <a:blip r:embed="rId6"/>
+                    <a:stretch>
+                      <a:fillRect/>
+                    </a:stretch>
+                  </pic:blipFill>
+                  <pic:spPr>
+                    <a:xfrm>
+                      <a:off x="0" y="0"/>
+                      <a:ext cx="5943600" cy="389255"/>
+                    </a:xfrm>
+                    <a:prstGeom prst="rect">
+                      <a:avLst/>
+                    </a:prstGeom>
+                  </pic:spPr>
+                </pic:pic>
+              </a:graphicData>
+            </a:graphic>
+          </wp:inline>
+        </w:drawing>
+      </w:r>
+    </w:p>
+    <w:p/>
+    <w:p/>
     <w:p>
       <w:pPr>
         <w:rPr>
@@ -76,12 +315,53 @@
         </w:numPr>
       </w:pPr>
       <w:r>
-        <w:t>For example if u want to reduce ((())) to (()). Then u have to reduce one level.</w:t>
-      </w:r>
-    </w:p>
-    <w:p>
-      <w:r>
-        <w:t>If u want to add the next element not the current element then first u check the condition and then increment. If u increment first then check the condition then u will add the current element.</w:t>
+        <w:t xml:space="preserve">For </w:t>
+      </w:r>
+      <w:proofErr w:type="gramStart"/>
+      <w:r>
+        <w:t>example</w:t>
+      </w:r>
+      <w:proofErr w:type="gramEnd"/>
+      <w:r>
+        <w:t xml:space="preserve"> if u want to reduce ((())) to (()). Then u have to reduce one level.</w:t>
+      </w:r>
+    </w:p>
+    <w:p>
+      <w:r>
+        <w:lastRenderedPageBreak/>
+        <w:t xml:space="preserve">If u want to add the next element not the current </w:t>
+      </w:r>
+      <w:proofErr w:type="gramStart"/>
+      <w:r>
+        <w:t>element</w:t>
+      </w:r>
+      <w:proofErr w:type="gramEnd"/>
+      <w:r>
+        <w:t xml:space="preserve"> then first u </w:t>
+      </w:r>
+      <w:proofErr w:type="gramStart"/>
+      <w:r>
+        <w:t>check</w:t>
+      </w:r>
+      <w:proofErr w:type="gramEnd"/>
+      <w:r>
+        <w:t xml:space="preserve"> the condition and then increment. If u increment first then </w:t>
+      </w:r>
+      <w:proofErr w:type="gramStart"/>
+      <w:r>
+        <w:t>check</w:t>
+      </w:r>
+      <w:proofErr w:type="gramEnd"/>
+      <w:r>
+        <w:t xml:space="preserve"> the </w:t>
+      </w:r>
+      <w:proofErr w:type="gramStart"/>
+      <w:r>
+        <w:t>condition</w:t>
+      </w:r>
+      <w:proofErr w:type="gramEnd"/>
+      <w:r>
+        <w:t xml:space="preserve"> then u will add the current element.</w:t>
       </w:r>
     </w:p>
     <w:p/>
@@ -173,7 +453,15 @@
       </w:r>
       <w:proofErr w:type="spellEnd"/>
       <w:r>
-        <w:t xml:space="preserve">(0,ravi.length-1) then It will give </w:t>
+        <w:t xml:space="preserve">(0,ravi.length-1) then </w:t>
+      </w:r>
+      <w:proofErr w:type="gramStart"/>
+      <w:r>
+        <w:t>It</w:t>
+      </w:r>
+      <w:proofErr w:type="gramEnd"/>
+      <w:r>
+        <w:t xml:space="preserve"> will give </w:t>
       </w:r>
       <w:proofErr w:type="spellStart"/>
       <w:r>
@@ -190,7 +478,6 @@
     <w:p>
       <w:proofErr w:type="spellStart"/>
       <w:r>
-        <w:lastRenderedPageBreak/>
         <w:t>String.prototype.substring</w:t>
       </w:r>
       <w:proofErr w:type="spellEnd"/>
@@ -229,7 +516,7 @@
                     <pic:cNvPicPr/>
                   </pic:nvPicPr>
                   <pic:blipFill>
-                    <a:blip r:embed="rId5"/>
+                    <a:blip r:embed="rId7"/>
                     <a:stretch>
                       <a:fillRect/>
                     </a:stretch>
@@ -337,6 +624,7 @@
     </w:p>
     <w:p>
       <w:r>
+        <w:lastRenderedPageBreak/>
         <w:t>Think of a string like a row of numbered boxes starting from 0:</w:t>
       </w:r>
     </w:p>
@@ -361,7 +649,7 @@
                     <pic:cNvPicPr/>
                   </pic:nvPicPr>
                   <pic:blipFill>
-                    <a:blip r:embed="rId6"/>
+                    <a:blip r:embed="rId8"/>
                     <a:stretch>
                       <a:fillRect/>
                     </a:stretch>
@@ -404,7 +692,7 @@
                     <pic:cNvPicPr/>
                   </pic:nvPicPr>
                   <pic:blipFill>
-                    <a:blip r:embed="rId7"/>
+                    <a:blip r:embed="rId9"/>
                     <a:stretch>
                       <a:fillRect/>
                     </a:stretch>
@@ -481,7 +769,7 @@
                     <pic:cNvPicPr/>
                   </pic:nvPicPr>
                   <pic:blipFill>
-                    <a:blip r:embed="rId8"/>
+                    <a:blip r:embed="rId10"/>
                     <a:stretch>
                       <a:fillRect/>
                     </a:stretch>
@@ -538,7 +826,7 @@
                     <pic:cNvPicPr/>
                   </pic:nvPicPr>
                   <pic:blipFill>
-                    <a:blip r:embed="rId9"/>
+                    <a:blip r:embed="rId11"/>
                     <a:stretch>
                       <a:fillRect/>
                     </a:stretch>
@@ -571,7 +859,6 @@
           <w:b/>
           <w:bCs/>
         </w:rPr>
-        <w:lastRenderedPageBreak/>
         <w:t>Start equals End → Returns empty string</w:t>
       </w:r>
     </w:p>
@@ -596,7 +883,7 @@
                     <pic:cNvPicPr/>
                   </pic:nvPicPr>
                   <pic:blipFill>
-                    <a:blip r:embed="rId10"/>
+                    <a:blip r:embed="rId12"/>
                     <a:stretch>
                       <a:fillRect/>
                     </a:stretch>
@@ -642,6 +929,7 @@
         <w:rPr>
           <w:noProof/>
         </w:rPr>
+        <w:lastRenderedPageBreak/>
         <w:drawing>
           <wp:inline distT="0" distB="0" distL="0" distR="0" wp14:anchorId="42139857" wp14:editId="760E52C7">
             <wp:extent cx="4806043" cy="1074171"/>
@@ -658,7 +946,7 @@
                     <pic:cNvPicPr/>
                   </pic:nvPicPr>
                   <pic:blipFill>
-                    <a:blip r:embed="rId11"/>
+                    <a:blip r:embed="rId13"/>
                     <a:stretch>
                       <a:fillRect/>
                     </a:stretch>
@@ -698,7 +986,7 @@
                     <pic:cNvPicPr/>
                   </pic:nvPicPr>
                   <pic:blipFill>
-                    <a:blip r:embed="rId12"/>
+                    <a:blip r:embed="rId14"/>
                     <a:stretch>
                       <a:fillRect/>
                     </a:stretch>
@@ -740,7 +1028,7 @@
                     <pic:cNvPicPr/>
                   </pic:nvPicPr>
                   <pic:blipFill>
-                    <a:blip r:embed="rId13"/>
+                    <a:blip r:embed="rId15"/>
                     <a:stretch>
                       <a:fillRect/>
                     </a:stretch>
@@ -854,7 +1142,23 @@
           <w:b/>
           <w:bCs/>
         </w:rPr>
-        <w:t>How to convert a string to a array (even with trailing and leading whitespace)</w:t>
+        <w:t xml:space="preserve">How to convert a string to </w:t>
+      </w:r>
+      <w:proofErr w:type="gramStart"/>
+      <w:r>
+        <w:rPr>
+          <w:b/>
+          <w:bCs/>
+        </w:rPr>
+        <w:t>a</w:t>
+      </w:r>
+      <w:proofErr w:type="gramEnd"/>
+      <w:r>
+        <w:rPr>
+          <w:b/>
+          <w:bCs/>
+        </w:rPr>
+        <w:t xml:space="preserve"> array (even with trailing and leading whitespace)</w:t>
       </w:r>
     </w:p>
     <w:p>
@@ -862,6 +1166,7 @@
         <w:rPr>
           <w:noProof/>
         </w:rPr>
+        <w:lastRenderedPageBreak/>
         <w:drawing>
           <wp:inline distT="0" distB="0" distL="0" distR="0" wp14:anchorId="723AE9D3" wp14:editId="0081E571">
             <wp:extent cx="5943600" cy="1231265"/>
@@ -878,7 +1183,7 @@
                     <pic:cNvPicPr/>
                   </pic:nvPicPr>
                   <pic:blipFill>
-                    <a:blip r:embed="rId14"/>
+                    <a:blip r:embed="rId16"/>
                     <a:stretch>
                       <a:fillRect/>
                     </a:stretch>
@@ -992,7 +1297,7 @@
                     <pic:cNvPicPr/>
                   </pic:nvPicPr>
                   <pic:blipFill>
-                    <a:blip r:embed="rId15"/>
+                    <a:blip r:embed="rId17"/>
                     <a:stretch>
                       <a:fillRect/>
                     </a:stretch>

</xml_diff>

<commit_message>
union of two arrays
</commit_message>
<xml_diff>
--- a/Theory/Learning.docx
+++ b/Theory/Learning.docx
@@ -18,6 +18,95 @@
           <w:sz w:val="32"/>
           <w:szCs w:val="32"/>
         </w:rPr>
+        <w:t>XOR</w:t>
+      </w:r>
+    </w:p>
+    <w:p>
+      <w:pPr>
+        <w:rPr>
+          <w:bCs/>
+        </w:rPr>
+      </w:pPr>
+      <w:r>
+        <w:rPr>
+          <w:bCs/>
+        </w:rPr>
+        <w:t>1 ^ 1 = 0</w:t>
+      </w:r>
+    </w:p>
+    <w:p>
+      <w:pPr>
+        <w:rPr>
+          <w:bCs/>
+        </w:rPr>
+      </w:pPr>
+      <w:r>
+        <w:rPr>
+          <w:bCs/>
+        </w:rPr>
+        <w:t>0 ^ 1 = 1</w:t>
+      </w:r>
+    </w:p>
+    <w:p>
+      <w:pPr>
+        <w:rPr>
+          <w:bCs/>
+        </w:rPr>
+      </w:pPr>
+    </w:p>
+    <w:p>
+      <w:pPr>
+        <w:rPr>
+          <w:bCs/>
+        </w:rPr>
+      </w:pPr>
+      <w:r>
+        <w:rPr>
+          <w:bCs/>
+        </w:rPr>
+        <w:t>To find the element appearing once in between the elements appearing twice u can use XOR</w:t>
+      </w:r>
+    </w:p>
+    <w:p>
+      <w:pPr>
+        <w:rPr>
+          <w:bCs/>
+        </w:rPr>
+      </w:pPr>
+    </w:p>
+    <w:p>
+      <w:pPr>
+        <w:rPr>
+          <w:bCs/>
+        </w:rPr>
+      </w:pPr>
+    </w:p>
+    <w:p>
+      <w:pPr>
+        <w:rPr>
+          <w:b/>
+          <w:bCs/>
+          <w:sz w:val="32"/>
+          <w:szCs w:val="32"/>
+        </w:rPr>
+      </w:pPr>
+    </w:p>
+    <w:p>
+      <w:pPr>
+        <w:rPr>
+          <w:b/>
+          <w:bCs/>
+          <w:sz w:val="32"/>
+          <w:szCs w:val="32"/>
+        </w:rPr>
+      </w:pPr>
+      <w:r>
+        <w:rPr>
+          <w:b/>
+          <w:bCs/>
+          <w:sz w:val="32"/>
+          <w:szCs w:val="32"/>
+        </w:rPr>
         <w:t>Arrays</w:t>
       </w:r>
     </w:p>
@@ -28,15 +117,7 @@
     </w:p>
     <w:p>
       <w:r>
-        <w:t xml:space="preserve">If we want to rotate the array for k times and so k can be greater </w:t>
-      </w:r>
-      <w:proofErr w:type="gramStart"/>
-      <w:r>
-        <w:t>then</w:t>
-      </w:r>
-      <w:proofErr w:type="gramEnd"/>
-      <w:r>
-        <w:t xml:space="preserve"> length of the array.</w:t>
+        <w:t>If we want to rotate the array for k times and so k can be greater then length of the array.</w:t>
       </w:r>
     </w:p>
     <w:p>
@@ -106,21 +187,12 @@
       <w:r>
         <w:t> temp. It creates a </w:t>
       </w:r>
-      <w:proofErr w:type="gramStart"/>
-      <w:r>
-        <w:rPr>
-          <w:b/>
-          <w:bCs/>
-        </w:rPr>
-        <w:t>brand new</w:t>
-      </w:r>
-      <w:proofErr w:type="gramEnd"/>
-      <w:r>
-        <w:rPr>
-          <w:b/>
-          <w:bCs/>
-        </w:rPr>
-        <w:t xml:space="preserve"> array</w:t>
+      <w:r>
+        <w:rPr>
+          <w:b/>
+          <w:bCs/>
+        </w:rPr>
+        <w:t>brand new array</w:t>
       </w:r>
       <w:r>
         <w:t> and reassigns temp to point to it.</w:t>
@@ -128,6 +200,9 @@
     </w:p>
     <w:p>
       <w:r>
+        <w:rPr>
+          <w:noProof/>
+        </w:rPr>
         <w:drawing>
           <wp:inline distT="0" distB="0" distL="0" distR="0" wp14:anchorId="2E6F54B7" wp14:editId="5642D975">
             <wp:extent cx="5943600" cy="419100"/>
@@ -166,13 +241,8 @@
       </w:r>
     </w:p>
     <w:p>
-      <w:proofErr w:type="gramStart"/>
-      <w:r>
-        <w:t>So</w:t>
-      </w:r>
-      <w:proofErr w:type="gramEnd"/>
-      <w:r>
-        <w:t xml:space="preserve"> whatever you had built in temp from the first loop is </w:t>
+      <w:r>
+        <w:t>So whatever you had built in temp from the first loop is </w:t>
       </w:r>
       <w:r>
         <w:rPr>
@@ -202,6 +272,9 @@
     </w:p>
     <w:p>
       <w:r>
+        <w:rPr>
+          <w:noProof/>
+        </w:rPr>
         <w:drawing>
           <wp:inline distT="0" distB="0" distL="0" distR="0" wp14:anchorId="583308D1" wp14:editId="570EBB6C">
             <wp:extent cx="5943600" cy="389255"/>
@@ -315,53 +388,12 @@
         </w:numPr>
       </w:pPr>
       <w:r>
-        <w:t xml:space="preserve">For </w:t>
-      </w:r>
-      <w:proofErr w:type="gramStart"/>
-      <w:r>
-        <w:t>example</w:t>
-      </w:r>
-      <w:proofErr w:type="gramEnd"/>
-      <w:r>
-        <w:t xml:space="preserve"> if u want to reduce ((())) to (()). Then u have to reduce one level.</w:t>
-      </w:r>
-    </w:p>
-    <w:p>
-      <w:r>
-        <w:lastRenderedPageBreak/>
-        <w:t xml:space="preserve">If u want to add the next element not the current </w:t>
-      </w:r>
-      <w:proofErr w:type="gramStart"/>
-      <w:r>
-        <w:t>element</w:t>
-      </w:r>
-      <w:proofErr w:type="gramEnd"/>
-      <w:r>
-        <w:t xml:space="preserve"> then first u </w:t>
-      </w:r>
-      <w:proofErr w:type="gramStart"/>
-      <w:r>
-        <w:t>check</w:t>
-      </w:r>
-      <w:proofErr w:type="gramEnd"/>
-      <w:r>
-        <w:t xml:space="preserve"> the condition and then increment. If u increment first then </w:t>
-      </w:r>
-      <w:proofErr w:type="gramStart"/>
-      <w:r>
-        <w:t>check</w:t>
-      </w:r>
-      <w:proofErr w:type="gramEnd"/>
-      <w:r>
-        <w:t xml:space="preserve"> the </w:t>
-      </w:r>
-      <w:proofErr w:type="gramStart"/>
-      <w:r>
-        <w:t>condition</w:t>
-      </w:r>
-      <w:proofErr w:type="gramEnd"/>
-      <w:r>
-        <w:t xml:space="preserve"> then u will add the current element.</w:t>
+        <w:t>For example if u want to reduce ((())) to (()). Then u have to reduce one level.</w:t>
+      </w:r>
+    </w:p>
+    <w:p>
+      <w:r>
+        <w:t>If u want to add the next element not the current element then first u check the condition and then increment. If u increment first then check the condition then u will add the current element.</w:t>
       </w:r>
     </w:p>
     <w:p/>
@@ -453,15 +485,7 @@
       </w:r>
       <w:proofErr w:type="spellEnd"/>
       <w:r>
-        <w:t xml:space="preserve">(0,ravi.length-1) then </w:t>
-      </w:r>
-      <w:proofErr w:type="gramStart"/>
-      <w:r>
-        <w:t>It</w:t>
-      </w:r>
-      <w:proofErr w:type="gramEnd"/>
-      <w:r>
-        <w:t xml:space="preserve"> will give </w:t>
+        <w:t xml:space="preserve">(0,ravi.length-1) then It will give </w:t>
       </w:r>
       <w:proofErr w:type="spellStart"/>
       <w:r>
@@ -478,6 +502,7 @@
     <w:p>
       <w:proofErr w:type="spellStart"/>
       <w:r>
+        <w:lastRenderedPageBreak/>
         <w:t>String.prototype.substring</w:t>
       </w:r>
       <w:proofErr w:type="spellEnd"/>
@@ -624,7 +649,6 @@
     </w:p>
     <w:p>
       <w:r>
-        <w:lastRenderedPageBreak/>
         <w:t>Think of a string like a row of numbered boxes starting from 0:</w:t>
       </w:r>
     </w:p>
@@ -859,6 +883,7 @@
           <w:b/>
           <w:bCs/>
         </w:rPr>
+        <w:lastRenderedPageBreak/>
         <w:t>Start equals End → Returns empty string</w:t>
       </w:r>
     </w:p>
@@ -929,7 +954,6 @@
         <w:rPr>
           <w:noProof/>
         </w:rPr>
-        <w:lastRenderedPageBreak/>
         <w:drawing>
           <wp:inline distT="0" distB="0" distL="0" distR="0" wp14:anchorId="42139857" wp14:editId="760E52C7">
             <wp:extent cx="4806043" cy="1074171"/>
@@ -1142,23 +1166,7 @@
           <w:b/>
           <w:bCs/>
         </w:rPr>
-        <w:t xml:space="preserve">How to convert a string to </w:t>
-      </w:r>
-      <w:proofErr w:type="gramStart"/>
-      <w:r>
-        <w:rPr>
-          <w:b/>
-          <w:bCs/>
-        </w:rPr>
-        <w:t>a</w:t>
-      </w:r>
-      <w:proofErr w:type="gramEnd"/>
-      <w:r>
-        <w:rPr>
-          <w:b/>
-          <w:bCs/>
-        </w:rPr>
-        <w:t xml:space="preserve"> array (even with trailing and leading whitespace)</w:t>
+        <w:t>How to convert a string to a array (even with trailing and leading whitespace)</w:t>
       </w:r>
     </w:p>
     <w:p>
@@ -1166,7 +1174,6 @@
         <w:rPr>
           <w:noProof/>
         </w:rPr>
-        <w:lastRenderedPageBreak/>
         <w:drawing>
           <wp:inline distT="0" distB="0" distL="0" distR="0" wp14:anchorId="723AE9D3" wp14:editId="0081E571">
             <wp:extent cx="5943600" cy="1231265"/>
@@ -2812,6 +2819,7 @@
   <w:style w:type="character" w:default="1" w:styleId="DefaultParagraphFont">
     <w:name w:val="Default Paragraph Font"/>
     <w:uiPriority w:val="1"/>
+    <w:semiHidden/>
     <w:unhideWhenUsed/>
   </w:style>
   <w:style w:type="table" w:default="1" w:styleId="TableNormal">

</xml_diff>